<commit_message>
update from jean-luc questions
</commit_message>
<xml_diff>
--- a/Note_developpement.docx
+++ b/Note_developpement.docx
@@ -1,6 +1,6 @@
 
 <file path=word/document.xml><?xml version="1.0" encoding="utf-8"?>
-<w:document xmlns:wpc="http://schemas.microsoft.com/office/word/2010/wordprocessingCanvas" xmlns:cx="http://schemas.microsoft.com/office/drawing/2014/chartex" xmlns:mc="http://schemas.openxmlformats.org/markup-compatibility/2006" xmlns:o="urn:schemas-microsoft-com:office:office" xmlns:r="http://schemas.openxmlformats.org/officeDocument/2006/relationships" xmlns:m="http://schemas.openxmlformats.org/officeDocument/2006/math" xmlns:v="urn:schemas-microsoft-com:vml" xmlns:wp14="http://schemas.microsoft.com/office/word/2010/wordprocessingDrawing" xmlns:wp="http://schemas.openxmlformats.org/drawingml/2006/wordprocessingDrawing" xmlns:w10="urn:schemas-microsoft-com:office:word" xmlns:w="http://schemas.openxmlformats.org/wordprocessingml/2006/main" xmlns:w14="http://schemas.microsoft.com/office/word/2010/wordml" xmlns:w15="http://schemas.microsoft.com/office/word/2012/wordml" xmlns:w16se="http://schemas.microsoft.com/office/word/2015/wordml/symex" xmlns:wpg="http://schemas.microsoft.com/office/word/2010/wordprocessingGroup" xmlns:wpi="http://schemas.microsoft.com/office/word/2010/wordprocessingInk" xmlns:wne="http://schemas.microsoft.com/office/word/2006/wordml" xmlns:wps="http://schemas.microsoft.com/office/word/2010/wordprocessingShape" mc:Ignorable="w14 w15 w16se wp14">
+<w:document xmlns:wpc="http://schemas.microsoft.com/office/word/2010/wordprocessingCanvas" xmlns:cx="http://schemas.microsoft.com/office/drawing/2014/chartex" xmlns:cx1="http://schemas.microsoft.com/office/drawing/2015/9/8/chartex" xmlns:cx2="http://schemas.microsoft.com/office/drawing/2015/10/21/chartex" xmlns:cx3="http://schemas.microsoft.com/office/drawing/2016/5/9/chartex" xmlns:cx4="http://schemas.microsoft.com/office/drawing/2016/5/10/chartex" xmlns:cx5="http://schemas.microsoft.com/office/drawing/2016/5/11/chartex" xmlns:cx6="http://schemas.microsoft.com/office/drawing/2016/5/12/chartex" xmlns:cx7="http://schemas.microsoft.com/office/drawing/2016/5/13/chartex" xmlns:cx8="http://schemas.microsoft.com/office/drawing/2016/5/14/chartex" xmlns:mc="http://schemas.openxmlformats.org/markup-compatibility/2006" xmlns:aink="http://schemas.microsoft.com/office/drawing/2016/ink" xmlns:am3d="http://schemas.microsoft.com/office/drawing/2017/model3d" xmlns:o="urn:schemas-microsoft-com:office:office" xmlns:oel="http://schemas.microsoft.com/office/2019/extlst" xmlns:r="http://schemas.openxmlformats.org/officeDocument/2006/relationships" xmlns:m="http://schemas.openxmlformats.org/officeDocument/2006/math" xmlns:v="urn:schemas-microsoft-com:vml" xmlns:wp14="http://schemas.microsoft.com/office/word/2010/wordprocessingDrawing" xmlns:wp="http://schemas.openxmlformats.org/drawingml/2006/wordprocessingDrawing" xmlns:w10="urn:schemas-microsoft-com:office:word" xmlns:w="http://schemas.openxmlformats.org/wordprocessingml/2006/main" xmlns:w14="http://schemas.microsoft.com/office/word/2010/wordml" xmlns:w15="http://schemas.microsoft.com/office/word/2012/wordml" xmlns:w16cex="http://schemas.microsoft.com/office/word/2018/wordml/cex" xmlns:w16cid="http://schemas.microsoft.com/office/word/2016/wordml/cid" xmlns:w16="http://schemas.microsoft.com/office/word/2018/wordml" xmlns:w16du="http://schemas.microsoft.com/office/word/2023/wordml/word16du" xmlns:w16sdtdh="http://schemas.microsoft.com/office/word/2020/wordml/sdtdatahash" xmlns:w16sdtfl="http://schemas.microsoft.com/office/word/2024/wordml/sdtformatlock" xmlns:w16se="http://schemas.microsoft.com/office/word/2015/wordml/symex" xmlns:wpg="http://schemas.microsoft.com/office/word/2010/wordprocessingGroup" xmlns:wpi="http://schemas.microsoft.com/office/word/2010/wordprocessingInk" xmlns:wne="http://schemas.microsoft.com/office/word/2006/wordml" xmlns:wps="http://schemas.microsoft.com/office/word/2010/wordprocessingShape" mc:Ignorable="w14 w15 w16se w16cid w16 w16cex w16sdtdh w16sdtfl w16du wp14">
   <w:body>
     <w:p>
       <w:pPr>
@@ -162,10 +162,11 @@
       </w:pPr>
       <w:r>
         <w:rPr>
+          <w:noProof/>
           <w:lang w:val="fr-CH"/>
         </w:rPr>
         <w:drawing>
-          <wp:inline distT="0" distB="0" distL="0" distR="0" wp14:anchorId="104C3A51" wp14:editId="00D8F46F">
+          <wp:inline distT="0" distB="0" distL="0" distR="0" wp14:anchorId="4D7FDCDC" wp14:editId="3D48CA93">
             <wp:extent cx="5943600" cy="3310890"/>
             <wp:effectExtent l="0" t="0" r="0" b="3810"/>
             <wp:docPr id="1" name="Picture 1"/>
@@ -291,11 +292,12 @@
       </w:pPr>
       <w:r>
         <w:rPr>
+          <w:noProof/>
           <w:lang w:val="fr-CH"/>
         </w:rPr>
         <w:lastRenderedPageBreak/>
         <w:drawing>
-          <wp:inline distT="0" distB="0" distL="0" distR="0" wp14:anchorId="2246E099" wp14:editId="378467D4">
+          <wp:inline distT="0" distB="0" distL="0" distR="0" wp14:anchorId="2C903D66" wp14:editId="34903D49">
             <wp:extent cx="5677692" cy="1686160"/>
             <wp:effectExtent l="0" t="0" r="0" b="9525"/>
             <wp:docPr id="4" name="Picture 4"/>
@@ -415,21 +417,7 @@
         <w:rPr>
           <w:lang w:val="fr-CH"/>
         </w:rPr>
-        <w:t xml:space="preserve">Pour le </w:t>
-      </w:r>
-      <w:proofErr w:type="spellStart"/>
-      <w:r>
-        <w:rPr>
-          <w:lang w:val="fr-CH"/>
-        </w:rPr>
-        <w:t>start</w:t>
-      </w:r>
-      <w:proofErr w:type="spellEnd"/>
-      <w:r>
-        <w:rPr>
-          <w:lang w:val="fr-CH"/>
-        </w:rPr>
-        <w:t xml:space="preserve"> et l’évolution de la manipulation dans le temps : </w:t>
+        <w:t xml:space="preserve">Pour le start et l’évolution de la manipulation dans le temps : </w:t>
       </w:r>
     </w:p>
     <w:p>
@@ -602,314 +590,690 @@
         <w:rPr>
           <w:lang w:val="fr-CH"/>
         </w:rPr>
+        <w:t xml:space="preserve"> 2? </w:t>
+      </w:r>
+      <w:r>
+        <w:rPr>
+          <w:lang w:val="fr-CH"/>
+        </w:rPr>
         <w:t xml:space="preserve"> </w:t>
       </w:r>
-      <w:proofErr w:type="gramStart"/>
-      <w:r>
-        <w:rPr>
-          <w:lang w:val="fr-CH"/>
-        </w:rPr>
-        <w:t>2?</w:t>
-      </w:r>
-      <w:proofErr w:type="gramEnd"/>
+    </w:p>
+    <w:p>
+      <w:pPr>
+        <w:rPr>
+          <w:lang w:val="fr-CH"/>
+        </w:rPr>
+      </w:pPr>
+      <w:r>
+        <w:rPr>
+          <w:lang w:val="fr-CH"/>
+        </w:rPr>
+        <w:t xml:space="preserve">Suggestion de </w:t>
+      </w:r>
+      <w:proofErr w:type="spellStart"/>
+      <w:r>
+        <w:rPr>
+          <w:lang w:val="fr-CH"/>
+        </w:rPr>
+        <w:t>chatGPT</w:t>
+      </w:r>
+      <w:proofErr w:type="spellEnd"/>
+      <w:r>
+        <w:rPr>
+          <w:lang w:val="fr-CH"/>
+        </w:rPr>
+        <w:t xml:space="preserve"> : </w:t>
+      </w:r>
+      <w:r>
+        <w:rPr>
+          <w:lang w:val="fr-CH"/>
+        </w:rPr>
+        <w:t>Utiliser une file d’attente (Queue) pour stocker les positions</w:t>
+      </w:r>
+      <w:r>
+        <w:rPr>
+          <w:lang w:val="fr-CH"/>
+        </w:rPr>
+        <w:t>.</w:t>
+      </w:r>
+    </w:p>
+    <w:p>
+      <w:pPr>
+        <w:rPr>
+          <w:lang w:val="fr-CH"/>
+        </w:rPr>
+      </w:pPr>
+      <w:r>
+        <w:rPr>
+          <w:lang w:val="fr-CH"/>
+        </w:rPr>
+        <w:t>L'idée est de stocker les positions reçues dans une file d’attente (Queue&lt;Vector3&gt;) et d’appliquer avec un décalage défini.</w:t>
+      </w:r>
+    </w:p>
+    <w:p>
+      <w:pPr>
+        <w:rPr>
+          <w:lang w:val="fr-CH"/>
+        </w:rPr>
+      </w:pPr>
+      <w:r>
+        <w:rPr>
+          <w:lang w:val="fr-CH"/>
+        </w:rPr>
+        <w:t xml:space="preserve">Script proposé enregistré dans le </w:t>
+      </w:r>
+      <w:r>
+        <w:rPr>
+          <w:lang w:val="fr-CH"/>
+        </w:rPr>
+        <w:t>\dev</w:t>
+      </w:r>
+      <w:r>
+        <w:rPr>
+          <w:lang w:val="fr-CH"/>
+        </w:rPr>
+        <w:t>\</w:t>
+      </w:r>
+      <w:proofErr w:type="spellStart"/>
+      <w:r>
+        <w:rPr>
+          <w:lang w:val="fr-CH"/>
+        </w:rPr>
+        <w:t>chatGPT_putDelay.cs</w:t>
+      </w:r>
+      <w:proofErr w:type="spellEnd"/>
       <w:r>
         <w:rPr>
           <w:lang w:val="fr-CH"/>
         </w:rPr>
         <w:t xml:space="preserve"> </w:t>
       </w:r>
+    </w:p>
+    <w:p>
+      <w:pPr>
+        <w:rPr>
+          <w:lang w:val="fr-CH"/>
+        </w:rPr>
+      </w:pPr>
+      <w:r>
+        <w:rPr>
+          <w:lang w:val="fr-CH"/>
+        </w:rPr>
+        <w:t>L’avatar applique les positions avec un retard défini (ex: 500 ms).</w:t>
+      </w:r>
+    </w:p>
+    <w:p>
+      <w:pPr>
+        <w:rPr>
+          <w:lang w:val="fr-CH"/>
+        </w:rPr>
+      </w:pPr>
+      <w:r>
+        <w:rPr>
+          <w:lang w:val="fr-CH"/>
+        </w:rPr>
+        <w:t xml:space="preserve">Tu peux modifier </w:t>
+      </w:r>
+      <w:proofErr w:type="spellStart"/>
+      <w:r>
+        <w:rPr>
+          <w:lang w:val="fr-CH"/>
+        </w:rPr>
+        <w:t>delayInSeconds</w:t>
+      </w:r>
+      <w:proofErr w:type="spellEnd"/>
+      <w:r>
+        <w:rPr>
+          <w:lang w:val="fr-CH"/>
+        </w:rPr>
+        <w:t xml:space="preserve"> pour ajuster le décalage.</w:t>
+      </w:r>
+    </w:p>
+    <w:p>
+      <w:pPr>
+        <w:rPr>
+          <w:lang w:val="fr-CH"/>
+        </w:rPr>
+      </w:pPr>
+    </w:p>
+    <w:p>
+      <w:pPr>
+        <w:rPr>
+          <w:lang w:val="fr-CH"/>
+        </w:rPr>
+      </w:pPr>
+    </w:p>
+    <w:p>
+      <w:pPr>
+        <w:rPr>
+          <w:lang w:val="fr-CH"/>
+        </w:rPr>
+      </w:pPr>
+    </w:p>
+    <w:p>
+      <w:pPr>
+        <w:rPr>
+          <w:lang w:val="fr-CH"/>
+        </w:rPr>
+      </w:pPr>
+      <w:r>
+        <w:rPr>
+          <w:lang w:val="fr-CH"/>
+        </w:rPr>
+        <w:t>Comment obtenir les position de l’</w:t>
+      </w:r>
+      <w:proofErr w:type="spellStart"/>
+      <w:r>
+        <w:rPr>
+          <w:lang w:val="fr-CH"/>
+        </w:rPr>
+        <w:t>optiTrack</w:t>
+      </w:r>
+      <w:proofErr w:type="spellEnd"/>
+      <w:r>
+        <w:rPr>
+          <w:lang w:val="fr-CH"/>
+        </w:rPr>
+        <w:t xml:space="preserve"> ? </w:t>
+      </w:r>
+    </w:p>
+    <w:p>
+      <w:pPr>
+        <w:rPr>
+          <w:lang w:val="fr-CH"/>
+        </w:rPr>
+      </w:pPr>
+      <w:proofErr w:type="spellStart"/>
+      <w:r>
+        <w:rPr>
+          <w:lang w:val="fr-CH"/>
+        </w:rPr>
+        <w:t>Peux-être</w:t>
+      </w:r>
+      <w:proofErr w:type="spellEnd"/>
+      <w:r>
+        <w:rPr>
+          <w:lang w:val="fr-CH"/>
+        </w:rPr>
+        <w:t xml:space="preserve"> dans le script </w:t>
+      </w:r>
+      <w:proofErr w:type="spellStart"/>
+      <w:r>
+        <w:rPr>
+          <w:lang w:val="fr-CH"/>
+        </w:rPr>
+        <w:t>OptitrackSkeletonAnimator</w:t>
+      </w:r>
+      <w:proofErr w:type="spellEnd"/>
+      <w:r>
+        <w:rPr>
+          <w:lang w:val="fr-CH"/>
+        </w:rPr>
+        <w:t xml:space="preserve">, </w:t>
+      </w:r>
+      <w:proofErr w:type="spellStart"/>
+      <w:r>
+        <w:rPr>
+          <w:lang w:val="fr-CH"/>
+        </w:rPr>
+        <w:t>function</w:t>
+      </w:r>
+      <w:proofErr w:type="spellEnd"/>
+      <w:r>
+        <w:rPr>
+          <w:lang w:val="fr-CH"/>
+        </w:rPr>
+        <w:t xml:space="preserve"> update ligne 141, la variable </w:t>
+      </w:r>
+      <w:proofErr w:type="spellStart"/>
+      <w:r>
+        <w:rPr>
+          <w:i/>
+          <w:lang w:val="fr-CH"/>
+        </w:rPr>
+        <w:t>bonePos</w:t>
+      </w:r>
+      <w:proofErr w:type="spellEnd"/>
+    </w:p>
+    <w:p>
+      <w:pPr>
+        <w:rPr>
+          <w:lang w:val="fr-CH"/>
+        </w:rPr>
+      </w:pPr>
+      <w:r>
+        <w:rPr>
+          <w:lang w:val="fr-CH"/>
+        </w:rPr>
+        <w:t xml:space="preserve"> C’est un </w:t>
+      </w:r>
+      <w:proofErr w:type="spellStart"/>
+      <w:r>
+        <w:rPr>
+          <w:lang w:val="fr-CH"/>
+        </w:rPr>
+        <w:t>object</w:t>
+      </w:r>
+      <w:proofErr w:type="spellEnd"/>
+      <w:r>
+        <w:rPr>
+          <w:lang w:val="fr-CH"/>
+        </w:rPr>
+        <w:t xml:space="preserve">, je peux pas l’afficher dans la console avec un </w:t>
+      </w:r>
+      <w:proofErr w:type="spellStart"/>
+      <w:r>
+        <w:rPr>
+          <w:lang w:val="fr-CH"/>
+        </w:rPr>
+        <w:t>Debug.Log</w:t>
+      </w:r>
+      <w:proofErr w:type="spellEnd"/>
+    </w:p>
+    <w:p>
+      <w:pPr>
+        <w:rPr>
+          <w:lang w:val="fr-CH"/>
+        </w:rPr>
+      </w:pPr>
+    </w:p>
+    <w:p>
+      <w:pPr>
+        <w:rPr>
+          <w:lang w:val="fr-CH"/>
+        </w:rPr>
+      </w:pPr>
+    </w:p>
+    <w:p>
+      <w:pPr>
+        <w:rPr>
+          <w:b/>
+          <w:bCs/>
+          <w:lang w:val="fr-CH"/>
+        </w:rPr>
+      </w:pPr>
+      <w:r>
+        <w:rPr>
+          <w:b/>
+          <w:bCs/>
+          <w:lang w:val="fr-CH"/>
+        </w:rPr>
+        <w:t>Séance de question avec Jean-Luc le 21.02.2025</w:t>
+      </w:r>
+    </w:p>
+    <w:p>
+      <w:pPr>
+        <w:rPr>
+          <w:lang w:val="fr-CH"/>
+        </w:rPr>
+      </w:pPr>
+    </w:p>
+    <w:p>
+      <w:pPr>
+        <w:rPr>
+          <w:i/>
+          <w:iCs/>
+          <w:lang w:val="fr-CH"/>
+        </w:rPr>
+      </w:pPr>
+      <w:r>
+        <w:rPr>
+          <w:i/>
+          <w:iCs/>
+          <w:lang w:val="fr-CH"/>
+        </w:rPr>
+        <w:t xml:space="preserve">Question 1, comment on peut connaître la position z pour faire dévier la trajectoire en fonction de ce qu’il avance à l’écran ? </w:t>
+      </w:r>
+    </w:p>
+    <w:p>
+      <w:pPr>
+        <w:rPr>
+          <w:lang w:val="fr-CH"/>
+        </w:rPr>
+      </w:pPr>
+      <w:r>
+        <w:rPr>
+          <w:lang w:val="fr-CH"/>
+        </w:rPr>
+        <w:t xml:space="preserve">C’est tout simple, il faut récupéré la position </w:t>
+      </w:r>
+      <w:proofErr w:type="spellStart"/>
+      <w:r>
+        <w:rPr>
+          <w:lang w:val="fr-CH"/>
+        </w:rPr>
+        <w:t>transform</w:t>
+      </w:r>
+      <w:proofErr w:type="spellEnd"/>
+      <w:r>
+        <w:rPr>
+          <w:lang w:val="fr-CH"/>
+        </w:rPr>
+        <w:t xml:space="preserve"> dans le sous-élément « </w:t>
+      </w:r>
+      <w:proofErr w:type="spellStart"/>
+      <w:r>
+        <w:rPr>
+          <w:lang w:val="fr-CH"/>
+        </w:rPr>
+        <w:t>HumanBaseMesh_Male</w:t>
+      </w:r>
+      <w:proofErr w:type="spellEnd"/>
+      <w:r>
+        <w:rPr>
+          <w:lang w:val="fr-CH"/>
+        </w:rPr>
+        <w:t>-&gt;</w:t>
+      </w:r>
+      <w:proofErr w:type="spellStart"/>
+      <w:r>
+        <w:rPr>
+          <w:lang w:val="fr-CH"/>
+        </w:rPr>
+        <w:t>Rig</w:t>
+      </w:r>
+      <w:proofErr w:type="spellEnd"/>
+      <w:r>
+        <w:rPr>
+          <w:lang w:val="fr-CH"/>
+        </w:rPr>
+        <w:t>-&gt;</w:t>
+      </w:r>
+      <w:r>
+        <w:rPr>
+          <w:lang w:val="fr-CH"/>
+        </w:rPr>
+        <w:t>B-root</w:t>
+      </w:r>
+      <w:r>
+        <w:rPr>
+          <w:lang w:val="fr-CH"/>
+        </w:rPr>
+        <w:t>-&gt;</w:t>
+      </w:r>
+      <w:r>
+        <w:rPr>
+          <w:lang w:val="fr-CH"/>
+        </w:rPr>
+        <w:t>B-</w:t>
+      </w:r>
+      <w:proofErr w:type="spellStart"/>
+      <w:r>
+        <w:rPr>
+          <w:lang w:val="fr-CH"/>
+        </w:rPr>
+        <w:t>hips</w:t>
+      </w:r>
+      <w:proofErr w:type="spellEnd"/>
+      <w:r>
+        <w:rPr>
+          <w:lang w:val="fr-CH"/>
+        </w:rPr>
+        <w:t xml:space="preserve"> ». La position du </w:t>
+      </w:r>
+      <w:proofErr w:type="spellStart"/>
+      <w:r>
+        <w:rPr>
+          <w:lang w:val="fr-CH"/>
+        </w:rPr>
+        <w:t>hips</w:t>
+      </w:r>
+      <w:proofErr w:type="spellEnd"/>
+      <w:r>
+        <w:rPr>
+          <w:lang w:val="fr-CH"/>
+        </w:rPr>
+        <w:t>(basin est modifier en continue par l’</w:t>
+      </w:r>
+      <w:proofErr w:type="spellStart"/>
+      <w:r>
+        <w:rPr>
+          <w:lang w:val="fr-CH"/>
+        </w:rPr>
+        <w:t>animator</w:t>
+      </w:r>
+      <w:proofErr w:type="spellEnd"/>
+      <w:r>
+        <w:rPr>
+          <w:lang w:val="fr-CH"/>
+        </w:rPr>
+        <w:t>. Il ne faut donc pas récupéré l’information directement du flux de l’</w:t>
+      </w:r>
+      <w:proofErr w:type="spellStart"/>
+      <w:r>
+        <w:rPr>
+          <w:lang w:val="fr-CH"/>
+        </w:rPr>
+        <w:t>optitrack</w:t>
+      </w:r>
+      <w:proofErr w:type="spellEnd"/>
+      <w:r>
+        <w:rPr>
+          <w:lang w:val="fr-CH"/>
+        </w:rPr>
+        <w:t xml:space="preserve"> mais simplement prendre la position de l’objet qui est animé ! </w:t>
+      </w:r>
+    </w:p>
+    <w:p>
+      <w:pPr>
+        <w:rPr>
+          <w:lang w:val="fr-CH"/>
+        </w:rPr>
+      </w:pPr>
+      <w:r>
+        <w:rPr>
+          <w:noProof/>
+        </w:rPr>
+        <w:drawing>
+          <wp:inline distT="0" distB="0" distL="0" distR="0" wp14:anchorId="6FAEC698" wp14:editId="67D57540">
+            <wp:extent cx="2152650" cy="2114550"/>
+            <wp:effectExtent l="0" t="0" r="0" b="0"/>
+            <wp:docPr id="467999693" name="Picture 1" descr="A screenshot of a computer&#10;&#10;AI-generated content may be incorrect."/>
+            <wp:cNvGraphicFramePr>
+              <a:graphicFrameLocks xmlns:a="http://schemas.openxmlformats.org/drawingml/2006/main" noChangeAspect="1"/>
+            </wp:cNvGraphicFramePr>
+            <a:graphic xmlns:a="http://schemas.openxmlformats.org/drawingml/2006/main">
+              <a:graphicData uri="http://schemas.openxmlformats.org/drawingml/2006/picture">
+                <pic:pic xmlns:pic="http://schemas.openxmlformats.org/drawingml/2006/picture">
+                  <pic:nvPicPr>
+                    <pic:cNvPr id="467999693" name="Picture 1" descr="A screenshot of a computer&#10;&#10;AI-generated content may be incorrect."/>
+                    <pic:cNvPicPr/>
+                  </pic:nvPicPr>
+                  <pic:blipFill>
+                    <a:blip r:embed="rId7"/>
+                    <a:stretch>
+                      <a:fillRect/>
+                    </a:stretch>
+                  </pic:blipFill>
+                  <pic:spPr>
+                    <a:xfrm>
+                      <a:off x="0" y="0"/>
+                      <a:ext cx="2152650" cy="2114550"/>
+                    </a:xfrm>
+                    <a:prstGeom prst="rect">
+                      <a:avLst/>
+                    </a:prstGeom>
+                  </pic:spPr>
+                </pic:pic>
+              </a:graphicData>
+            </a:graphic>
+          </wp:inline>
+        </w:drawing>
+      </w:r>
+    </w:p>
+    <w:p>
+      <w:pPr>
+        <w:rPr>
+          <w:lang w:val="fr-CH"/>
+        </w:rPr>
+      </w:pPr>
+      <w:r>
+        <w:rPr>
+          <w:lang w:val="fr-CH"/>
+        </w:rPr>
+        <w:t xml:space="preserve">Sinon Jean-Luc pense que appliquer une rotation comme je le propose est une bonne idée. Plutôt que manipuler la </w:t>
+      </w:r>
+      <w:proofErr w:type="spellStart"/>
+      <w:r>
+        <w:rPr>
+          <w:lang w:val="fr-CH"/>
+        </w:rPr>
+        <w:t>transform</w:t>
+      </w:r>
+      <w:proofErr w:type="spellEnd"/>
+      <w:r>
+        <w:rPr>
+          <w:lang w:val="fr-CH"/>
+        </w:rPr>
+        <w:t xml:space="preserve"> de l’avatar, il changerait la position d’un </w:t>
+      </w:r>
+      <w:proofErr w:type="spellStart"/>
+      <w:r>
+        <w:rPr>
+          <w:lang w:val="fr-CH"/>
+        </w:rPr>
+        <w:t>plateform</w:t>
+      </w:r>
+      <w:proofErr w:type="spellEnd"/>
+      <w:r>
+        <w:rPr>
+          <w:lang w:val="fr-CH"/>
+        </w:rPr>
+        <w:t xml:space="preserve"> invisible. Mais je vais pas retenir cette idée car c’est compliquer pour pas grand-chose. </w:t>
+      </w:r>
+    </w:p>
+    <w:p>
+      <w:pPr>
+        <w:rPr>
+          <w:lang w:val="fr-CH"/>
+        </w:rPr>
+      </w:pPr>
+    </w:p>
+    <w:p>
+      <w:pPr>
+        <w:rPr>
+          <w:i/>
+          <w:iCs/>
+          <w:lang w:val="fr-CH"/>
+        </w:rPr>
+      </w:pPr>
+      <w:r>
+        <w:rPr>
+          <w:i/>
+          <w:iCs/>
+          <w:lang w:val="fr-CH"/>
+        </w:rPr>
+        <w:t xml:space="preserve">Question2, comment on peut décaler dans le temps ? </w:t>
+      </w:r>
+    </w:p>
+    <w:p>
+      <w:pPr>
+        <w:rPr>
+          <w:lang w:val="fr-CH"/>
+        </w:rPr>
+      </w:pPr>
+      <w:r>
+        <w:rPr>
+          <w:lang w:val="fr-CH"/>
+        </w:rPr>
+        <w:t xml:space="preserve">Jean-Luc a déjà fait cette manipulation par le passé. D’abord l’avatar qui reçois </w:t>
+      </w:r>
+      <w:r>
+        <w:rPr>
+          <w:lang w:val="fr-CH"/>
+        </w:rPr>
+        <w:t>les positions</w:t>
+      </w:r>
+      <w:r>
+        <w:rPr>
+          <w:lang w:val="fr-CH"/>
+        </w:rPr>
+        <w:t xml:space="preserve"> en temps réelle est mis hors champs</w:t>
+      </w:r>
+      <w:r>
+        <w:rPr>
+          <w:lang w:val="fr-CH"/>
+        </w:rPr>
+        <w:t xml:space="preserve">. Ensuite, il a écrit un script qui permet d’enregistrer les positions de chaque sous </w:t>
+      </w:r>
+      <w:proofErr w:type="spellStart"/>
+      <w:r>
+        <w:rPr>
+          <w:lang w:val="fr-CH"/>
+        </w:rPr>
+        <w:t>game-object</w:t>
+      </w:r>
+      <w:proofErr w:type="spellEnd"/>
+      <w:r>
+        <w:rPr>
+          <w:lang w:val="fr-CH"/>
+        </w:rPr>
+        <w:t xml:space="preserve"> de l’avatar (comme </w:t>
+      </w:r>
+      <w:proofErr w:type="spellStart"/>
+      <w:r>
+        <w:rPr>
+          <w:lang w:val="fr-CH"/>
+        </w:rPr>
+        <w:t>hips</w:t>
+      </w:r>
+      <w:proofErr w:type="spellEnd"/>
+      <w:r>
+        <w:rPr>
+          <w:lang w:val="fr-CH"/>
+        </w:rPr>
+        <w:t xml:space="preserve">, ……). Il utilise un fix update à 50 ou 100 Hz au lieu de l’update classique. Il a enregistrer ces position dans un fichier JASON. </w:t>
+      </w:r>
+      <w:r>
+        <w:rPr>
+          <w:lang w:val="fr-CH"/>
+        </w:rPr>
+        <w:br/>
+        <w:t xml:space="preserve">Puis il utilise un autre </w:t>
+      </w:r>
+      <w:proofErr w:type="spellStart"/>
+      <w:r>
+        <w:rPr>
+          <w:lang w:val="fr-CH"/>
+        </w:rPr>
+        <w:t>fixupdate</w:t>
+      </w:r>
+      <w:proofErr w:type="spellEnd"/>
+      <w:r>
+        <w:rPr>
+          <w:lang w:val="fr-CH"/>
+        </w:rPr>
+        <w:t xml:space="preserve"> pour appliquer ces position </w:t>
+      </w:r>
+      <w:proofErr w:type="spellStart"/>
+      <w:r>
+        <w:rPr>
+          <w:lang w:val="fr-CH"/>
+        </w:rPr>
+        <w:t>transform</w:t>
+      </w:r>
+      <w:proofErr w:type="spellEnd"/>
+      <w:r>
+        <w:rPr>
+          <w:lang w:val="fr-CH"/>
+        </w:rPr>
+        <w:t xml:space="preserve"> de chaque </w:t>
+      </w:r>
+      <w:proofErr w:type="spellStart"/>
+      <w:r>
+        <w:rPr>
+          <w:lang w:val="fr-CH"/>
+        </w:rPr>
+        <w:t>game</w:t>
+      </w:r>
+      <w:proofErr w:type="spellEnd"/>
       <w:r>
         <w:rPr>
           <w:lang w:val="fr-CH"/>
         </w:rPr>
         <w:t xml:space="preserve"> </w:t>
       </w:r>
-    </w:p>
-    <w:p>
-      <w:pPr>
-        <w:rPr>
-          <w:lang w:val="fr-CH"/>
-        </w:rPr>
-      </w:pPr>
-      <w:r>
-        <w:rPr>
-          <w:lang w:val="fr-CH"/>
-        </w:rPr>
-        <w:t xml:space="preserve">Suggestion de </w:t>
-      </w:r>
-      <w:proofErr w:type="spellStart"/>
-      <w:r>
-        <w:rPr>
-          <w:lang w:val="fr-CH"/>
-        </w:rPr>
-        <w:t>chatGPT</w:t>
-      </w:r>
-      <w:proofErr w:type="spellEnd"/>
-      <w:r>
-        <w:rPr>
-          <w:lang w:val="fr-CH"/>
-        </w:rPr>
-        <w:t xml:space="preserve"> : </w:t>
-      </w:r>
-      <w:r>
-        <w:rPr>
-          <w:lang w:val="fr-CH"/>
-        </w:rPr>
-        <w:t>Utiliser une file d’attente (Queue) pour stocker les positions</w:t>
-      </w:r>
-      <w:r>
-        <w:rPr>
-          <w:lang w:val="fr-CH"/>
-        </w:rPr>
-        <w:t>.</w:t>
-      </w:r>
-    </w:p>
-    <w:p>
-      <w:pPr>
-        <w:rPr>
-          <w:lang w:val="fr-CH"/>
-        </w:rPr>
-      </w:pPr>
-      <w:r>
-        <w:rPr>
-          <w:lang w:val="fr-CH"/>
-        </w:rPr>
-        <w:t>L'idée est de stocker les positions reçues dans une file d’attente (Queue&lt;Vector3&gt;) et d’appliquer avec un décalage défini.</w:t>
-      </w:r>
-    </w:p>
-    <w:p>
-      <w:pPr>
-        <w:rPr>
-          <w:lang w:val="fr-CH"/>
-        </w:rPr>
-      </w:pPr>
-      <w:r>
-        <w:rPr>
-          <w:lang w:val="fr-CH"/>
-        </w:rPr>
-        <w:t xml:space="preserve">Script proposé enregistré dans le </w:t>
-      </w:r>
-      <w:r>
-        <w:rPr>
-          <w:lang w:val="fr-CH"/>
-        </w:rPr>
-        <w:t>\</w:t>
-      </w:r>
-      <w:proofErr w:type="spellStart"/>
-      <w:r>
-        <w:rPr>
-          <w:lang w:val="fr-CH"/>
-        </w:rPr>
-        <w:t>dev</w:t>
-      </w:r>
-      <w:proofErr w:type="spellEnd"/>
-      <w:r>
-        <w:rPr>
-          <w:lang w:val="fr-CH"/>
-        </w:rPr>
-        <w:t>\</w:t>
-      </w:r>
-      <w:proofErr w:type="spellStart"/>
-      <w:r>
-        <w:rPr>
-          <w:lang w:val="fr-CH"/>
-        </w:rPr>
-        <w:t>chatGPT_putDelay.cs</w:t>
-      </w:r>
-      <w:proofErr w:type="spellEnd"/>
-      <w:r>
-        <w:rPr>
-          <w:lang w:val="fr-CH"/>
-        </w:rPr>
-        <w:t xml:space="preserve"> </w:t>
-      </w:r>
-    </w:p>
-    <w:p>
-      <w:pPr>
-        <w:rPr>
-          <w:lang w:val="fr-CH"/>
-        </w:rPr>
-      </w:pPr>
-      <w:r>
-        <w:rPr>
-          <w:lang w:val="fr-CH"/>
-        </w:rPr>
-        <w:t>L’avatar applique les positions avec un retard défini (</w:t>
-      </w:r>
-      <w:proofErr w:type="gramStart"/>
-      <w:r>
-        <w:rPr>
-          <w:lang w:val="fr-CH"/>
-        </w:rPr>
-        <w:t>ex:</w:t>
-      </w:r>
-      <w:proofErr w:type="gramEnd"/>
-      <w:r>
-        <w:rPr>
-          <w:lang w:val="fr-CH"/>
-        </w:rPr>
-        <w:t xml:space="preserve"> 500 ms).</w:t>
-      </w:r>
-    </w:p>
-    <w:p>
-      <w:pPr>
-        <w:rPr>
-          <w:lang w:val="fr-CH"/>
-        </w:rPr>
-      </w:pPr>
-      <w:r>
-        <w:rPr>
-          <w:lang w:val="fr-CH"/>
-        </w:rPr>
-        <w:t xml:space="preserve">Tu peux modifier </w:t>
-      </w:r>
-      <w:proofErr w:type="spellStart"/>
-      <w:r>
-        <w:rPr>
-          <w:lang w:val="fr-CH"/>
-        </w:rPr>
-        <w:t>delayInSeconds</w:t>
-      </w:r>
-      <w:proofErr w:type="spellEnd"/>
-      <w:r>
-        <w:rPr>
-          <w:lang w:val="fr-CH"/>
-        </w:rPr>
-        <w:t xml:space="preserve"> pour ajuster le décalage.</w:t>
-      </w:r>
-    </w:p>
-    <w:p>
-      <w:pPr>
-        <w:rPr>
-          <w:lang w:val="fr-CH"/>
-        </w:rPr>
-      </w:pPr>
-    </w:p>
-    <w:p>
-      <w:pPr>
-        <w:rPr>
-          <w:lang w:val="fr-CH"/>
-        </w:rPr>
-      </w:pPr>
-    </w:p>
-    <w:p>
-      <w:pPr>
-        <w:rPr>
-          <w:lang w:val="fr-CH"/>
-        </w:rPr>
-      </w:pPr>
-    </w:p>
-    <w:p>
-      <w:pPr>
-        <w:rPr>
-          <w:lang w:val="fr-CH"/>
-        </w:rPr>
-      </w:pPr>
-      <w:r>
-        <w:rPr>
-          <w:lang w:val="fr-CH"/>
-        </w:rPr>
-        <w:t xml:space="preserve">Comment obtenir </w:t>
-      </w:r>
-      <w:proofErr w:type="gramStart"/>
-      <w:r>
-        <w:rPr>
-          <w:lang w:val="fr-CH"/>
-        </w:rPr>
-        <w:t>les position</w:t>
-      </w:r>
-      <w:proofErr w:type="gramEnd"/>
-      <w:r>
-        <w:rPr>
-          <w:lang w:val="fr-CH"/>
-        </w:rPr>
-        <w:t xml:space="preserve"> de l’</w:t>
-      </w:r>
-      <w:proofErr w:type="spellStart"/>
-      <w:r>
-        <w:rPr>
-          <w:lang w:val="fr-CH"/>
-        </w:rPr>
-        <w:t>optiTrack</w:t>
-      </w:r>
-      <w:proofErr w:type="spellEnd"/>
-      <w:r>
-        <w:rPr>
-          <w:lang w:val="fr-CH"/>
-        </w:rPr>
-        <w:t xml:space="preserve"> ? </w:t>
-      </w:r>
-    </w:p>
-    <w:p>
-      <w:pPr>
-        <w:rPr>
-          <w:lang w:val="fr-CH"/>
-        </w:rPr>
-      </w:pPr>
-      <w:proofErr w:type="spellStart"/>
-      <w:r>
-        <w:rPr>
-          <w:lang w:val="fr-CH"/>
-        </w:rPr>
-        <w:t>Peux-être</w:t>
-      </w:r>
-      <w:proofErr w:type="spellEnd"/>
-      <w:r>
-        <w:rPr>
-          <w:lang w:val="fr-CH"/>
-        </w:rPr>
-        <w:t xml:space="preserve"> dans le script </w:t>
-      </w:r>
-      <w:proofErr w:type="spellStart"/>
-      <w:r>
-        <w:rPr>
-          <w:lang w:val="fr-CH"/>
-        </w:rPr>
-        <w:t>OptitrackSkeletonAnimator</w:t>
-      </w:r>
-      <w:proofErr w:type="spellEnd"/>
-      <w:r>
-        <w:rPr>
-          <w:lang w:val="fr-CH"/>
-        </w:rPr>
-        <w:t xml:space="preserve">, </w:t>
-      </w:r>
-      <w:proofErr w:type="spellStart"/>
-      <w:r>
-        <w:rPr>
-          <w:lang w:val="fr-CH"/>
-        </w:rPr>
-        <w:t>function</w:t>
-      </w:r>
-      <w:proofErr w:type="spellEnd"/>
-      <w:r>
-        <w:rPr>
-          <w:lang w:val="fr-CH"/>
-        </w:rPr>
-        <w:t xml:space="preserve"> update ligne 141, la variable </w:t>
-      </w:r>
-      <w:proofErr w:type="spellStart"/>
-      <w:r>
-        <w:rPr>
-          <w:i/>
-          <w:lang w:val="fr-CH"/>
-        </w:rPr>
-        <w:t>bonePos</w:t>
-      </w:r>
-      <w:proofErr w:type="spellEnd"/>
-    </w:p>
-    <w:p>
-      <w:pPr>
-        <w:rPr>
-          <w:lang w:val="fr-CH"/>
-        </w:rPr>
-      </w:pPr>
-      <w:r>
-        <w:rPr>
-          <w:lang w:val="fr-CH"/>
-        </w:rPr>
-        <w:t xml:space="preserve"> C’est un </w:t>
-      </w:r>
       <w:proofErr w:type="spellStart"/>
       <w:r>
         <w:rPr>
@@ -922,46 +1286,22 @@
         <w:rPr>
           <w:lang w:val="fr-CH"/>
         </w:rPr>
-        <w:t xml:space="preserve">, </w:t>
-      </w:r>
-      <w:proofErr w:type="gramStart"/>
-      <w:r>
-        <w:rPr>
-          <w:lang w:val="fr-CH"/>
-        </w:rPr>
-        <w:t>je peux pas</w:t>
-      </w:r>
-      <w:proofErr w:type="gramEnd"/>
-      <w:r>
-        <w:rPr>
-          <w:lang w:val="fr-CH"/>
-        </w:rPr>
-        <w:t xml:space="preserve"> l’afficher dans la console avec un </w:t>
-      </w:r>
-      <w:proofErr w:type="spellStart"/>
-      <w:r>
-        <w:rPr>
-          <w:lang w:val="fr-CH"/>
-        </w:rPr>
-        <w:t>Debug.Log</w:t>
-      </w:r>
-      <w:proofErr w:type="spellEnd"/>
-    </w:p>
-    <w:p>
-      <w:pPr>
-        <w:rPr>
-          <w:lang w:val="fr-CH"/>
-        </w:rPr>
-      </w:pPr>
-      <w:bookmarkStart w:id="0" w:name="_GoBack"/>
-      <w:bookmarkEnd w:id="0"/>
-    </w:p>
-    <w:p>
-      <w:pPr>
-        <w:rPr>
-          <w:lang w:val="fr-CH"/>
-        </w:rPr>
-      </w:pPr>
+        <w:t xml:space="preserve"> à un autre avatar qui n’est pas connecté à l’</w:t>
+      </w:r>
+      <w:proofErr w:type="spellStart"/>
+      <w:r>
+        <w:rPr>
+          <w:lang w:val="fr-CH"/>
+        </w:rPr>
+        <w:t>optitrack</w:t>
+      </w:r>
+      <w:proofErr w:type="spellEnd"/>
+      <w:r>
+        <w:rPr>
+          <w:lang w:val="fr-CH"/>
+        </w:rPr>
+        <w:t xml:space="preserve">. Comme ça, on peux géré la vitesse de replay.   </w:t>
+      </w:r>
     </w:p>
     <w:sectPr>
       <w:pgSz w:w="12240" w:h="15840"/>
@@ -974,7 +1314,7 @@
 </file>
 
 <file path=word/numbering.xml><?xml version="1.0" encoding="utf-8"?>
-<w:numbering xmlns:wpc="http://schemas.microsoft.com/office/word/2010/wordprocessingCanvas" xmlns:cx="http://schemas.microsoft.com/office/drawing/2014/chartex" xmlns:mc="http://schemas.openxmlformats.org/markup-compatibility/2006" xmlns:o="urn:schemas-microsoft-com:office:office" xmlns:r="http://schemas.openxmlformats.org/officeDocument/2006/relationships" xmlns:m="http://schemas.openxmlformats.org/officeDocument/2006/math" xmlns:v="urn:schemas-microsoft-com:vml" xmlns:wp14="http://schemas.microsoft.com/office/word/2010/wordprocessingDrawing" xmlns:wp="http://schemas.openxmlformats.org/drawingml/2006/wordprocessingDrawing" xmlns:w10="urn:schemas-microsoft-com:office:word" xmlns:w="http://schemas.openxmlformats.org/wordprocessingml/2006/main" xmlns:w14="http://schemas.microsoft.com/office/word/2010/wordml" xmlns:w15="http://schemas.microsoft.com/office/word/2012/wordml" xmlns:w16se="http://schemas.microsoft.com/office/word/2015/wordml/symex" xmlns:wpg="http://schemas.microsoft.com/office/word/2010/wordprocessingGroup" xmlns:wpi="http://schemas.microsoft.com/office/word/2010/wordprocessingInk" xmlns:wne="http://schemas.microsoft.com/office/word/2006/wordml" xmlns:wps="http://schemas.microsoft.com/office/word/2010/wordprocessingShape" mc:Ignorable="w14 w15 w16se wp14">
+<w:numbering xmlns:wpc="http://schemas.microsoft.com/office/word/2010/wordprocessingCanvas" xmlns:cx="http://schemas.microsoft.com/office/drawing/2014/chartex" xmlns:cx1="http://schemas.microsoft.com/office/drawing/2015/9/8/chartex" xmlns:cx2="http://schemas.microsoft.com/office/drawing/2015/10/21/chartex" xmlns:cx3="http://schemas.microsoft.com/office/drawing/2016/5/9/chartex" xmlns:cx4="http://schemas.microsoft.com/office/drawing/2016/5/10/chartex" xmlns:cx5="http://schemas.microsoft.com/office/drawing/2016/5/11/chartex" xmlns:cx6="http://schemas.microsoft.com/office/drawing/2016/5/12/chartex" xmlns:cx7="http://schemas.microsoft.com/office/drawing/2016/5/13/chartex" xmlns:cx8="http://schemas.microsoft.com/office/drawing/2016/5/14/chartex" xmlns:mc="http://schemas.openxmlformats.org/markup-compatibility/2006" xmlns:aink="http://schemas.microsoft.com/office/drawing/2016/ink" xmlns:am3d="http://schemas.microsoft.com/office/drawing/2017/model3d" xmlns:o="urn:schemas-microsoft-com:office:office" xmlns:oel="http://schemas.microsoft.com/office/2019/extlst" xmlns:r="http://schemas.openxmlformats.org/officeDocument/2006/relationships" xmlns:m="http://schemas.openxmlformats.org/officeDocument/2006/math" xmlns:v="urn:schemas-microsoft-com:vml" xmlns:wp14="http://schemas.microsoft.com/office/word/2010/wordprocessingDrawing" xmlns:wp="http://schemas.openxmlformats.org/drawingml/2006/wordprocessingDrawing" xmlns:w10="urn:schemas-microsoft-com:office:word" xmlns:w="http://schemas.openxmlformats.org/wordprocessingml/2006/main" xmlns:w14="http://schemas.microsoft.com/office/word/2010/wordml" xmlns:w15="http://schemas.microsoft.com/office/word/2012/wordml" xmlns:w16cex="http://schemas.microsoft.com/office/word/2018/wordml/cex" xmlns:w16cid="http://schemas.microsoft.com/office/word/2016/wordml/cid" xmlns:w16="http://schemas.microsoft.com/office/word/2018/wordml" xmlns:w16du="http://schemas.microsoft.com/office/word/2023/wordml/word16du" xmlns:w16sdtdh="http://schemas.microsoft.com/office/word/2020/wordml/sdtdatahash" xmlns:w16sdtfl="http://schemas.microsoft.com/office/word/2024/wordml/sdtformatlock" xmlns:w16se="http://schemas.microsoft.com/office/word/2015/wordml/symex" xmlns:wpg="http://schemas.microsoft.com/office/word/2010/wordprocessingGroup" xmlns:wpi="http://schemas.microsoft.com/office/word/2010/wordprocessingInk" xmlns:wne="http://schemas.microsoft.com/office/word/2006/wordml" xmlns:wps="http://schemas.microsoft.com/office/word/2010/wordprocessingShape" mc:Ignorable="w14 w15 w16se w16cid w16 w16cex w16sdtdh w16sdtfl w16du wp14">
   <w:abstractNum w:abstractNumId="0" w15:restartNumberingAfterBreak="0">
     <w:nsid w:val="3D482DF1"/>
     <w:multiLevelType w:val="hybridMultilevel"/>
@@ -1064,14 +1404,106 @@
       </w:pPr>
     </w:lvl>
   </w:abstractNum>
-  <w:num w:numId="1">
+  <w:abstractNum w:abstractNumId="1" w15:restartNumberingAfterBreak="0">
+    <w:nsid w:val="40D60F8C"/>
+    <w:multiLevelType w:val="hybridMultilevel"/>
+    <w:tmpl w:val="15664E0A"/>
+    <w:lvl w:ilvl="0" w:tplc="100C000F">
+      <w:start w:val="1"/>
+      <w:numFmt w:val="decimal"/>
+      <w:lvlText w:val="%1."/>
+      <w:lvlJc w:val="left"/>
+      <w:pPr>
+        <w:ind w:left="720" w:hanging="360"/>
+      </w:pPr>
+      <w:rPr>
+        <w:rFonts w:hint="default"/>
+      </w:rPr>
+    </w:lvl>
+    <w:lvl w:ilvl="1" w:tplc="100C0019" w:tentative="1">
+      <w:start w:val="1"/>
+      <w:numFmt w:val="lowerLetter"/>
+      <w:lvlText w:val="%2."/>
+      <w:lvlJc w:val="left"/>
+      <w:pPr>
+        <w:ind w:left="1440" w:hanging="360"/>
+      </w:pPr>
+    </w:lvl>
+    <w:lvl w:ilvl="2" w:tplc="100C001B" w:tentative="1">
+      <w:start w:val="1"/>
+      <w:numFmt w:val="lowerRoman"/>
+      <w:lvlText w:val="%3."/>
+      <w:lvlJc w:val="right"/>
+      <w:pPr>
+        <w:ind w:left="2160" w:hanging="180"/>
+      </w:pPr>
+    </w:lvl>
+    <w:lvl w:ilvl="3" w:tplc="100C000F" w:tentative="1">
+      <w:start w:val="1"/>
+      <w:numFmt w:val="decimal"/>
+      <w:lvlText w:val="%4."/>
+      <w:lvlJc w:val="left"/>
+      <w:pPr>
+        <w:ind w:left="2880" w:hanging="360"/>
+      </w:pPr>
+    </w:lvl>
+    <w:lvl w:ilvl="4" w:tplc="100C0019" w:tentative="1">
+      <w:start w:val="1"/>
+      <w:numFmt w:val="lowerLetter"/>
+      <w:lvlText w:val="%5."/>
+      <w:lvlJc w:val="left"/>
+      <w:pPr>
+        <w:ind w:left="3600" w:hanging="360"/>
+      </w:pPr>
+    </w:lvl>
+    <w:lvl w:ilvl="5" w:tplc="100C001B" w:tentative="1">
+      <w:start w:val="1"/>
+      <w:numFmt w:val="lowerRoman"/>
+      <w:lvlText w:val="%6."/>
+      <w:lvlJc w:val="right"/>
+      <w:pPr>
+        <w:ind w:left="4320" w:hanging="180"/>
+      </w:pPr>
+    </w:lvl>
+    <w:lvl w:ilvl="6" w:tplc="100C000F" w:tentative="1">
+      <w:start w:val="1"/>
+      <w:numFmt w:val="decimal"/>
+      <w:lvlText w:val="%7."/>
+      <w:lvlJc w:val="left"/>
+      <w:pPr>
+        <w:ind w:left="5040" w:hanging="360"/>
+      </w:pPr>
+    </w:lvl>
+    <w:lvl w:ilvl="7" w:tplc="100C0019" w:tentative="1">
+      <w:start w:val="1"/>
+      <w:numFmt w:val="lowerLetter"/>
+      <w:lvlText w:val="%8."/>
+      <w:lvlJc w:val="left"/>
+      <w:pPr>
+        <w:ind w:left="5760" w:hanging="360"/>
+      </w:pPr>
+    </w:lvl>
+    <w:lvl w:ilvl="8" w:tplc="100C001B" w:tentative="1">
+      <w:start w:val="1"/>
+      <w:numFmt w:val="lowerRoman"/>
+      <w:lvlText w:val="%9."/>
+      <w:lvlJc w:val="right"/>
+      <w:pPr>
+        <w:ind w:left="6480" w:hanging="180"/>
+      </w:pPr>
+    </w:lvl>
+  </w:abstractNum>
+  <w:num w:numId="1" w16cid:durableId="392776409">
     <w:abstractNumId w:val="0"/>
+  </w:num>
+  <w:num w:numId="2" w16cid:durableId="1505432483">
+    <w:abstractNumId w:val="1"/>
   </w:num>
 </w:numbering>
 </file>
 
 <file path=word/styles.xml><?xml version="1.0" encoding="utf-8"?>
-<w:styles xmlns:mc="http://schemas.openxmlformats.org/markup-compatibility/2006" xmlns:r="http://schemas.openxmlformats.org/officeDocument/2006/relationships" xmlns:w="http://schemas.openxmlformats.org/wordprocessingml/2006/main" xmlns:w14="http://schemas.microsoft.com/office/word/2010/wordml" xmlns:w15="http://schemas.microsoft.com/office/word/2012/wordml" xmlns:w16se="http://schemas.microsoft.com/office/word/2015/wordml/symex" mc:Ignorable="w14 w15 w16se">
+<w:styles xmlns:mc="http://schemas.openxmlformats.org/markup-compatibility/2006" xmlns:r="http://schemas.openxmlformats.org/officeDocument/2006/relationships" xmlns:w="http://schemas.openxmlformats.org/wordprocessingml/2006/main" xmlns:w14="http://schemas.microsoft.com/office/word/2010/wordml" xmlns:w15="http://schemas.microsoft.com/office/word/2012/wordml" xmlns:w16cex="http://schemas.microsoft.com/office/word/2018/wordml/cex" xmlns:w16cid="http://schemas.microsoft.com/office/word/2016/wordml/cid" xmlns:w16="http://schemas.microsoft.com/office/word/2018/wordml" xmlns:w16du="http://schemas.microsoft.com/office/word/2023/wordml/word16du" xmlns:w16sdtdh="http://schemas.microsoft.com/office/word/2020/wordml/sdtdatahash" xmlns:w16sdtfl="http://schemas.microsoft.com/office/word/2024/wordml/sdtformatlock" xmlns:w16se="http://schemas.microsoft.com/office/word/2015/wordml/symex" mc:Ignorable="w14 w15 w16se w16cid w16 w16cex w16sdtdh w16sdtfl w16du">
   <w:docDefaults>
     <w:rPrDefault>
       <w:rPr>
@@ -1087,7 +1519,7 @@
       </w:pPr>
     </w:pPrDefault>
   </w:docDefaults>
-  <w:latentStyles w:defLockedState="0" w:defUIPriority="99" w:defSemiHidden="0" w:defUnhideWhenUsed="0" w:defQFormat="0" w:count="371">
+  <w:latentStyles w:defLockedState="0" w:defUIPriority="99" w:defSemiHidden="0" w:defUnhideWhenUsed="0" w:defQFormat="0" w:count="376">
     <w:lsdException w:name="Normal" w:uiPriority="0" w:qFormat="1"/>
     <w:lsdException w:name="heading 1" w:uiPriority="9" w:qFormat="1"/>
     <w:lsdException w:name="heading 2" w:semiHidden="1" w:uiPriority="9" w:unhideWhenUsed="1" w:qFormat="1"/>
@@ -1459,6 +1891,11 @@
     <w:lsdException w:name="List Table 5 Dark Accent 6" w:uiPriority="50"/>
     <w:lsdException w:name="List Table 6 Colorful Accent 6" w:uiPriority="51"/>
     <w:lsdException w:name="List Table 7 Colorful Accent 6" w:uiPriority="52"/>
+    <w:lsdException w:name="Mention" w:semiHidden="1" w:unhideWhenUsed="1"/>
+    <w:lsdException w:name="Smart Hyperlink" w:semiHidden="1" w:unhideWhenUsed="1"/>
+    <w:lsdException w:name="Hashtag" w:semiHidden="1" w:unhideWhenUsed="1"/>
+    <w:lsdException w:name="Unresolved Mention" w:semiHidden="1" w:unhideWhenUsed="1"/>
+    <w:lsdException w:name="Smart Link" w:semiHidden="1" w:unhideWhenUsed="1"/>
   </w:latentStyles>
   <w:style w:type="paragraph" w:default="1" w:styleId="Normal">
     <w:name w:val="Normal"/>

</xml_diff>